<commit_message>
Correct Professor Ebarb-Matt name in IPSEL guidelines
Upload 19 -- 10/16/26
</commit_message>
<xml_diff>
--- a/assets/docs/IPSEL_Certificate.docx
+++ b/assets/docs/IPSEL_Certificate.docx
@@ -1373,7 +1373,19 @@
         <w:rPr>
           <w:rFonts w:ascii="Times New Roman" w:hAnsi="Times New Roman" w:cs="Times New Roman"/>
         </w:rPr>
-        <w:t>Professor Tia Ebarb Matt</w:t>
+        <w:t>Professor Tia Ebarb</w:t>
+      </w:r>
+      <w:r>
+        <w:rPr>
+          <w:rFonts w:ascii="Times New Roman" w:hAnsi="Times New Roman" w:cs="Times New Roman"/>
+        </w:rPr>
+        <w:t>-</w:t>
+      </w:r>
+      <w:r>
+        <w:rPr>
+          <w:rFonts w:ascii="Times New Roman" w:hAnsi="Times New Roman" w:cs="Times New Roman"/>
+        </w:rPr>
+        <w:t>Matt</w:t>
       </w:r>
       <w:r>
         <w:rPr>
@@ -4192,15 +4204,6 @@
 </file>
 
 <file path=customXml/item1.xml><?xml version="1.0" encoding="utf-8"?>
-<?mso-contentType ?>
-<FormTemplates xmlns="http://schemas.microsoft.com/sharepoint/v3/contenttype/forms">
-  <Display>DocumentLibraryForm</Display>
-  <Edit>DocumentLibraryForm</Edit>
-  <New>DocumentLibraryForm</New>
-</FormTemplates>
-</file>
-
-<file path=customXml/item2.xml><?xml version="1.0" encoding="utf-8"?>
 <ct:contentTypeSchema xmlns:ct="http://schemas.microsoft.com/office/2006/metadata/contentType" xmlns:ma="http://schemas.microsoft.com/office/2006/metadata/properties/metaAttributes" ct:_="" ma:_="" ma:contentTypeName="Document" ma:contentTypeID="0x010100C07EB91754A0D2478DD8AF77D4756E52" ma:contentTypeVersion="17" ma:contentTypeDescription="Create a new document." ma:contentTypeScope="" ma:versionID="7151ce08642763b022880831221c13a0">
   <xsd:schema xmlns:xsd="http://www.w3.org/2001/XMLSchema" xmlns:xs="http://www.w3.org/2001/XMLSchema" xmlns:p="http://schemas.microsoft.com/office/2006/metadata/properties" xmlns:ns3="3c8a7d8d-54cc-44a7-b01b-66954c7b7805" xmlns:ns4="db10d6ec-49c3-4bb2-b7a5-ee60bf2c8966" targetNamespace="http://schemas.microsoft.com/office/2006/metadata/properties" ma:root="true" ma:fieldsID="e16d052ee2842e0409de361498fbbea6" ns3:_="" ns4:_="">
     <xsd:import namespace="3c8a7d8d-54cc-44a7-b01b-66954c7b7805"/>
@@ -4447,6 +4450,15 @@
 </ct:contentTypeSchema>
 </file>
 
+<file path=customXml/item2.xml><?xml version="1.0" encoding="utf-8"?>
+<?mso-contentType ?>
+<FormTemplates xmlns="http://schemas.microsoft.com/sharepoint/v3/contenttype/forms">
+  <Display>DocumentLibraryForm</Display>
+  <Edit>DocumentLibraryForm</Edit>
+  <New>DocumentLibraryForm</New>
+</FormTemplates>
+</file>
+
 <file path=customXml/item3.xml><?xml version="1.0" encoding="utf-8"?>
 <p:properties xmlns:p="http://schemas.microsoft.com/office/2006/metadata/properties" xmlns:xsi="http://www.w3.org/2001/XMLSchema-instance" xmlns:pc="http://schemas.microsoft.com/office/infopath/2007/PartnerControls">
   <documentManagement>
@@ -4456,14 +4468,6 @@
 </file>
 
 <file path=customXml/itemProps1.xml><?xml version="1.0" encoding="utf-8"?>
-<ds:datastoreItem xmlns:ds="http://schemas.openxmlformats.org/officeDocument/2006/customXml" ds:itemID="{AC1953E1-C33E-4ED7-9023-ED1A09E58CAD}">
-  <ds:schemaRefs>
-    <ds:schemaRef ds:uri="http://schemas.microsoft.com/sharepoint/v3/contenttype/forms"/>
-  </ds:schemaRefs>
-</ds:datastoreItem>
-</file>
-
-<file path=customXml/itemProps2.xml><?xml version="1.0" encoding="utf-8"?>
 <ds:datastoreItem xmlns:ds="http://schemas.openxmlformats.org/officeDocument/2006/customXml" ds:itemID="{CED17BF0-CED3-4C3D-9519-3BC1D3CC0F9D}">
   <ds:schemaRefs>
     <ds:schemaRef ds:uri="http://schemas.microsoft.com/office/2006/metadata/contentType"/>
@@ -4482,6 +4486,14 @@
 </ds:datastoreItem>
 </file>
 
+<file path=customXml/itemProps2.xml><?xml version="1.0" encoding="utf-8"?>
+<ds:datastoreItem xmlns:ds="http://schemas.openxmlformats.org/officeDocument/2006/customXml" ds:itemID="{AC1953E1-C33E-4ED7-9023-ED1A09E58CAD}">
+  <ds:schemaRefs>
+    <ds:schemaRef ds:uri="http://schemas.microsoft.com/sharepoint/v3/contenttype/forms"/>
+  </ds:schemaRefs>
+</ds:datastoreItem>
+</file>
+
 <file path=customXml/itemProps3.xml><?xml version="1.0" encoding="utf-8"?>
 <ds:datastoreItem xmlns:ds="http://schemas.openxmlformats.org/officeDocument/2006/customXml" ds:itemID="{65B53B33-CCBC-414D-BB88-1BA8C3DB6882}">
   <ds:schemaRefs>

</xml_diff>